<commit_message>
feat(cil): livret CIL v02 (09-09-2026) — avis de désherbage du CRC
- Nouvelle action « Avis de désherbage (CRC) » : choix « Désherbage en
  cours » Oui / Non (Non par défaut) et heure « Avisé à » (TimeField,
  comme le reste du livret). Enregistré comme événement de chronologie
  AVIS_DESHERBAGE (metadata { enCours }) — repris dans le récit du RCI
- En-tête du livret : état du désherbage et heure du dernier avis
- Modèle Word passé en v02 : ligne « Désherbage ☐ OUI ☐ NON — Avisé à »,
  cases COS / OPJ / Pompes Fun. de « Départ effectif » sur fond rouge,
  pied de page « v02 du 09-09-2026 ». Sans avis, les cases restent vides
- Tests : données docx (dernier avis, absence d'avis), actions disponibles

Co-Authored-By: Claude Opus 5.5 <noreply@anthropic.com>
</commit_message>
<xml_diff>
--- a/public/cil/template.docx
+++ b/public/cil/template.docx
@@ -574,9 +574,17 @@
                 <w:b/>
                 <w:color w:val="000000"/>
                 <w:sz w:val="14"/>
-                <w:szCs w:val="14"/>
               </w:rPr>
             </w:pPr>
+            <w:r>
+              <w:rPr>
+                <w:rFonts w:ascii="Times New Roman" w:hAnsi="Times New Roman"/>
+                <w:b/>
+                <w:color w:val="231F20"/>
+                <w:sz w:val="14"/>
+              </w:rPr>
+              <w:t>Désherbage</w:t>
+            </w:r>
           </w:p>
         </w:tc>
         <w:tc>
@@ -585,24 +593,9 @@
             <w:gridSpan w:val="2"/>
           </w:tcPr>
           <w:p>
-            <w:pPr>
-              <w:tabs>
-                <w:tab w:val="left" w:pos="8507"/>
-                <w:tab w:val="left" w:pos="12474"/>
-                <w:tab w:val="left" w:pos="13878"/>
-                <w:tab w:val="left" w:pos="15272"/>
-              </w:tabs>
-              <w:kinsoku w:val="0"/>
-              <w:overflowPunct w:val="0"/>
-              <w:jc w:val="both"/>
-              <w:rPr>
-                <w:rFonts w:ascii="Times New Roman" w:hAnsi="Times New Roman"/>
-                <w:b/>
-                <w:color w:val="000000"/>
-                <w:sz w:val="14"/>
-                <w:szCs w:val="14"/>
-              </w:rPr>
-            </w:pPr>
+            <w:r>
+              <w:t>{check_desh_oui} OUI    {check_desh_non} NON          Avisé à {txt_desh_avise}</w:t>
+            </w:r>
           </w:p>
         </w:tc>
       </w:tr>
@@ -17919,7 +17912,7 @@
     </w:r>
     <w:proofErr w:type="gramEnd"/>
     <w:r>
-      <w:t>01 du 09-06-2024</w:t>
+      <w:t>02 du 09-09-2026</w:t>
     </w:r>
   </w:p>
   <w:p>

</xml_diff>